<commit_message>
Mise à jour V6 pour soutenance
</commit_message>
<xml_diff>
--- a/MP-frontend/public/templates/AppelOffre.docx
+++ b/MP-frontend/public/templates/AppelOffre.docx
@@ -130,8 +130,6 @@
         </w:rPr>
         <w:t>}</w:t>
       </w:r>
-      <w:bookmarkStart w:id="0" w:name="_GoBack"/>
-      <w:bookmarkEnd w:id="0"/>
     </w:p>
     <w:p>
       <w:pPr>
@@ -266,18 +264,26 @@
           <w:sz w:val="24"/>
           <w:szCs w:val="24"/>
         </w:rPr>
+        <w:t xml:space="preserve"> </w:t>
+      </w:r>
+      <w:bookmarkStart w:id="0" w:name="_GoBack"/>
+      <w:bookmarkEnd w:id="0"/>
+      <w:r>
+        <w:rPr>
+          <w:rFonts w:asciiTheme="majorBidi" w:hAnsiTheme="majorBidi" w:cstheme="majorBidi"/>
+          <w:sz w:val="24"/>
+          <w:szCs w:val="24"/>
+        </w:rPr>
         <w:t>{</w:t>
       </w:r>
-      <w:proofErr w:type="spellStart"/>
-      <w:r>
-        <w:rPr>
-          <w:rFonts w:asciiTheme="majorBidi" w:hAnsiTheme="majorBidi" w:cstheme="majorBidi"/>
-          <w:sz w:val="24"/>
-          <w:szCs w:val="24"/>
-        </w:rPr>
-        <w:t>idMarcheAO</w:t>
-      </w:r>
-      <w:proofErr w:type="spellEnd"/>
+      <w:r>
+        <w:rPr>
+          <w:rFonts w:asciiTheme="majorBidi" w:hAnsiTheme="majorBidi" w:cstheme="majorBidi"/>
+          <w:sz w:val="24"/>
+          <w:szCs w:val="24"/>
+        </w:rPr>
+        <w:t>idMarche</w:t>
+      </w:r>
       <w:r>
         <w:rPr>
           <w:rFonts w:asciiTheme="majorBidi" w:hAnsiTheme="majorBidi" w:cstheme="majorBidi"/>

</xml_diff>

<commit_message>
Mise à jour V7
</commit_message>
<xml_diff>
--- a/MP-frontend/public/templates/AppelOffre.docx
+++ b/MP-frontend/public/templates/AppelOffre.docx
@@ -34,9 +34,10 @@
           <w:szCs w:val="32"/>
           <w:u w:val="single"/>
         </w:rPr>
-        <w:t>{</w:t>
-      </w:r>
-      <w:proofErr w:type="spellStart"/>
+        <w:t>{T</w:t>
+      </w:r>
+      <w:bookmarkStart w:id="0" w:name="_GoBack"/>
+      <w:bookmarkEnd w:id="0"/>
       <w:r>
         <w:rPr>
           <w:rFonts w:asciiTheme="majorBidi" w:hAnsiTheme="majorBidi" w:cstheme="majorBidi"/>
@@ -46,7 +47,7 @@
           <w:szCs w:val="32"/>
           <w:u w:val="single"/>
         </w:rPr>
-        <w:t>type</w:t>
+        <w:t>ype</w:t>
       </w:r>
       <w:r>
         <w:rPr>
@@ -59,7 +60,6 @@
         </w:rPr>
         <w:t>AO</w:t>
       </w:r>
-      <w:proofErr w:type="spellEnd"/>
       <w:r>
         <w:rPr>
           <w:rFonts w:asciiTheme="majorBidi" w:hAnsiTheme="majorBidi" w:cstheme="majorBidi"/>
@@ -148,6 +148,7 @@
       <w:pPr>
         <w:spacing w:line="276" w:lineRule="auto"/>
         <w:ind w:firstLine="708"/>
+        <w:jc w:val="both"/>
         <w:rPr>
           <w:rFonts w:asciiTheme="majorBidi" w:hAnsiTheme="majorBidi" w:cstheme="majorBidi"/>
           <w:b/>
@@ -256,7 +257,41 @@
           <w:sz w:val="24"/>
           <w:szCs w:val="24"/>
         </w:rPr>
-        <w:t xml:space="preserve"> Massa à Agadir à l'ouverture des plis relatifs à l'appel d'offres ouvert national sur offres de prix n°</w:t>
+        <w:t xml:space="preserve"> Massa à Agadir à l'ouverture des plis relatifs à l'appel d'offres ouvert </w:t>
+      </w:r>
+      <w:r>
+        <w:rPr>
+          <w:rFonts w:asciiTheme="majorBidi" w:hAnsiTheme="majorBidi" w:cstheme="majorBidi"/>
+          <w:sz w:val="24"/>
+          <w:szCs w:val="24"/>
+        </w:rPr>
+        <w:t>{</w:t>
+      </w:r>
+      <w:proofErr w:type="spellStart"/>
+      <w:r>
+        <w:rPr>
+          <w:rFonts w:asciiTheme="majorBidi" w:hAnsiTheme="majorBidi" w:cstheme="majorBidi"/>
+          <w:sz w:val="24"/>
+          <w:szCs w:val="24"/>
+        </w:rPr>
+        <w:t>typeAO</w:t>
+      </w:r>
+      <w:proofErr w:type="spellEnd"/>
+      <w:r>
+        <w:rPr>
+          <w:rFonts w:asciiTheme="majorBidi" w:hAnsiTheme="majorBidi" w:cstheme="majorBidi"/>
+          <w:sz w:val="24"/>
+          <w:szCs w:val="24"/>
+        </w:rPr>
+        <w:t xml:space="preserve">} </w:t>
+      </w:r>
+      <w:r>
+        <w:rPr>
+          <w:rFonts w:asciiTheme="majorBidi" w:hAnsiTheme="majorBidi" w:cstheme="majorBidi"/>
+          <w:sz w:val="24"/>
+          <w:szCs w:val="24"/>
+        </w:rPr>
+        <w:t>sur offres de prix n°</w:t>
       </w:r>
       <w:r>
         <w:rPr>
@@ -266,8 +301,6 @@
         </w:rPr>
         <w:t xml:space="preserve"> </w:t>
       </w:r>
-      <w:bookmarkStart w:id="0" w:name="_GoBack"/>
-      <w:bookmarkEnd w:id="0"/>
       <w:r>
         <w:rPr>
           <w:rFonts w:asciiTheme="majorBidi" w:hAnsiTheme="majorBidi" w:cstheme="majorBidi"/>
@@ -337,6 +370,7 @@
       <w:pPr>
         <w:spacing w:line="276" w:lineRule="auto"/>
         <w:ind w:firstLine="708"/>
+        <w:jc w:val="both"/>
         <w:rPr>
           <w:rFonts w:asciiTheme="majorBidi" w:hAnsiTheme="majorBidi" w:cstheme="majorBidi"/>
           <w:sz w:val="24"/>
@@ -356,6 +390,7 @@
       <w:pPr>
         <w:spacing w:before="240" w:after="0"/>
         <w:ind w:firstLine="708"/>
+        <w:jc w:val="both"/>
         <w:rPr>
           <w:rFonts w:asciiTheme="majorBidi" w:hAnsiTheme="majorBidi" w:cstheme="majorBidi"/>
           <w:sz w:val="24"/>
@@ -370,16 +405,14 @@
         </w:rPr>
         <w:t xml:space="preserve">L'estimation des coûts </w:t>
       </w:r>
-      <w:proofErr w:type="gramStart"/>
-      <w:r>
-        <w:rPr>
-          <w:rFonts w:asciiTheme="majorBidi" w:hAnsiTheme="majorBidi" w:cstheme="majorBidi"/>
-          <w:sz w:val="24"/>
-          <w:szCs w:val="24"/>
-        </w:rPr>
-        <w:t>des prestations établie</w:t>
-      </w:r>
-      <w:proofErr w:type="gramEnd"/>
+      <w:r>
+        <w:rPr>
+          <w:rFonts w:asciiTheme="majorBidi" w:hAnsiTheme="majorBidi" w:cstheme="majorBidi"/>
+          <w:sz w:val="24"/>
+          <w:szCs w:val="24"/>
+        </w:rPr>
+        <w:t>des prestations établies</w:t>
+      </w:r>
       <w:r>
         <w:rPr>
           <w:rFonts w:asciiTheme="majorBidi" w:hAnsiTheme="majorBidi" w:cstheme="majorBidi"/>
@@ -392,6 +425,7 @@
     <w:p>
       <w:pPr>
         <w:spacing w:after="0"/>
+        <w:jc w:val="both"/>
         <w:rPr>
           <w:rFonts w:asciiTheme="majorBidi" w:hAnsiTheme="majorBidi" w:cstheme="majorBidi"/>
           <w:sz w:val="24"/>
@@ -477,6 +511,7 @@
     </w:p>
     <w:p>
       <w:pPr>
+        <w:jc w:val="both"/>
         <w:rPr>
           <w:rFonts w:asciiTheme="majorBidi" w:hAnsiTheme="majorBidi" w:cstheme="majorBidi"/>
           <w:sz w:val="24"/>
@@ -488,6 +523,7 @@
       <w:pPr>
         <w:spacing w:after="0"/>
         <w:ind w:firstLine="708"/>
+        <w:jc w:val="both"/>
         <w:rPr>
           <w:rFonts w:asciiTheme="majorBidi" w:hAnsiTheme="majorBidi" w:cstheme="majorBidi"/>
           <w:sz w:val="24"/>
@@ -507,6 +543,7 @@
       <w:pPr>
         <w:spacing w:after="0"/>
         <w:ind w:firstLine="708"/>
+        <w:jc w:val="both"/>
         <w:rPr>
           <w:rFonts w:asciiTheme="majorBidi" w:hAnsiTheme="majorBidi" w:cstheme="majorBidi"/>
           <w:sz w:val="24"/>
@@ -608,6 +645,7 @@
     </w:p>
     <w:p>
       <w:pPr>
+        <w:jc w:val="both"/>
         <w:rPr>
           <w:rFonts w:asciiTheme="majorBidi" w:hAnsiTheme="majorBidi" w:cstheme="majorBidi"/>
           <w:sz w:val="24"/>
@@ -618,6 +656,7 @@
     <w:p>
       <w:pPr>
         <w:ind w:firstLine="708"/>
+        <w:jc w:val="both"/>
         <w:rPr>
           <w:rFonts w:asciiTheme="majorBidi" w:hAnsiTheme="majorBidi" w:cstheme="majorBidi"/>
           <w:sz w:val="24"/>
@@ -636,6 +675,7 @@
     <w:p>
       <w:pPr>
         <w:spacing w:before="240"/>
+        <w:jc w:val="both"/>
         <w:rPr>
           <w:rFonts w:asciiTheme="majorBidi" w:hAnsiTheme="majorBidi" w:cstheme="majorBidi"/>
           <w:sz w:val="24"/>
@@ -693,6 +733,7 @@
     </w:p>
     <w:p>
       <w:pPr>
+        <w:jc w:val="both"/>
         <w:rPr>
           <w:rFonts w:asciiTheme="majorBidi" w:hAnsiTheme="majorBidi" w:cstheme="majorBidi"/>
           <w:sz w:val="24"/>
@@ -703,6 +744,7 @@
     <w:p>
       <w:pPr>
         <w:ind w:firstLine="708"/>
+        <w:jc w:val="both"/>
         <w:rPr>
           <w:rFonts w:asciiTheme="majorBidi" w:hAnsiTheme="majorBidi" w:cstheme="majorBidi"/>
           <w:sz w:val="24"/>
@@ -718,7 +760,11 @@
         <w:t>Les pièces justificatives à fournir sont celles prévues par l'article 4 du Règlement de Consultation.</w:t>
       </w:r>
     </w:p>
-    <w:p/>
+    <w:p>
+      <w:pPr>
+        <w:jc w:val="both"/>
+      </w:pPr>
+    </w:p>
     <w:sectPr>
       <w:headerReference w:type="default" r:id="rId7"/>
       <w:pgSz w:w="11906" w:h="16838"/>
@@ -784,91 +830,6 @@
 <w:hdr xmlns:wpc="http://schemas.microsoft.com/office/word/2010/wordprocessingCanvas" xmlns:cx="http://schemas.microsoft.com/office/drawing/2014/chartex" xmlns:cx1="http://schemas.microsoft.com/office/drawing/2015/9/8/chartex" xmlns:mc="http://schemas.openxmlformats.org/markup-compatibility/2006" xmlns:o="urn:schemas-microsoft-com:office:office" xmlns:r="http://schemas.openxmlformats.org/officeDocument/2006/relationships" xmlns:m="http://schemas.openxmlformats.org/officeDocument/2006/math" xmlns:v="urn:schemas-microsoft-com:vml" xmlns:wp14="http://schemas.microsoft.com/office/word/2010/wordprocessingDrawing" xmlns:wp="http://schemas.openxmlformats.org/drawingml/2006/wordprocessingDrawing" xmlns:w10="urn:schemas-microsoft-com:office:word" xmlns:w="http://schemas.openxmlformats.org/wordprocessingml/2006/main" xmlns:w14="http://schemas.microsoft.com/office/word/2010/wordml" xmlns:w15="http://schemas.microsoft.com/office/word/2012/wordml" xmlns:w16se="http://schemas.microsoft.com/office/word/2015/wordml/symex" xmlns:wpg="http://schemas.microsoft.com/office/word/2010/wordprocessingGroup" xmlns:wpi="http://schemas.microsoft.com/office/word/2010/wordprocessingInk" xmlns:wne="http://schemas.microsoft.com/office/word/2006/wordml" xmlns:wps="http://schemas.microsoft.com/office/word/2010/wordprocessingShape" mc:Ignorable="w14 w15 w16se wp14">
   <w:p>
     <w:pPr>
-      <w:pStyle w:val="Titre"/>
-      <w:rPr>
-        <w:iCs/>
-        <w:sz w:val="22"/>
-        <w:szCs w:val="22"/>
-      </w:rPr>
-    </w:pPr>
-    <w:r>
-      <w:rPr>
-        <w:iCs/>
-        <w:sz w:val="22"/>
-        <w:szCs w:val="22"/>
-      </w:rPr>
-      <w:t>ROYAUME DU MAROC</w:t>
-    </w:r>
-  </w:p>
-  <w:p>
-    <w:pPr>
-      <w:pStyle w:val="Titre"/>
-      <w:rPr>
-        <w:sz w:val="22"/>
-        <w:szCs w:val="22"/>
-      </w:rPr>
-    </w:pPr>
-    <w:r>
-      <w:rPr>
-        <w:sz w:val="22"/>
-        <w:szCs w:val="22"/>
-      </w:rPr>
-      <w:t>MINISTERE DE L’EQUIPEMET ET DE L’EAU</w:t>
-    </w:r>
-  </w:p>
-  <w:p>
-    <w:pPr>
-      <w:pStyle w:val="Pieddepage"/>
-      <w:jc w:val="center"/>
-      <w:rPr>
-        <w:rFonts w:ascii="Times New Roman" w:hAnsi="Times New Roman"/>
-        <w:b/>
-      </w:rPr>
-    </w:pPr>
-    <w:r>
-      <w:rPr>
-        <w:rFonts w:ascii="Times New Roman" w:hAnsi="Times New Roman"/>
-        <w:b/>
-      </w:rPr>
-      <w:t xml:space="preserve">DIRECTION REGIONALE DE L’ÉQUIPEMENT, </w:t>
-    </w:r>
-    <w:r>
-      <w:rPr>
-        <w:rFonts w:ascii="Times New Roman" w:hAnsi="Times New Roman"/>
-        <w:b/>
-      </w:rPr>
-      <w:t>DU TRANSPORT,</w:t>
-    </w:r>
-  </w:p>
-  <w:p>
-    <w:pPr>
-      <w:pStyle w:val="Pieddepage"/>
-      <w:jc w:val="center"/>
-      <w:rPr>
-        <w:rFonts w:ascii="Times New Roman" w:hAnsi="Times New Roman"/>
-        <w:b/>
-      </w:rPr>
-    </w:pPr>
-    <w:r>
-      <w:rPr>
-        <w:rFonts w:ascii="Times New Roman" w:hAnsi="Times New Roman"/>
-        <w:b/>
-      </w:rPr>
-      <w:t xml:space="preserve"> ET DE LA LOGISTIQUE DE</w:t>
-    </w:r>
-    <w:r>
-      <w:t xml:space="preserve"> </w:t>
-    </w:r>
-    <w:r>
-      <w:rPr>
-        <w:rFonts w:ascii="Times New Roman" w:hAnsi="Times New Roman"/>
-        <w:b/>
-      </w:rPr>
-      <w:t>SOUSS MASSA - AGADIR-</w:t>
-    </w:r>
-  </w:p>
-  <w:p>
-    <w:pPr>
       <w:pStyle w:val="Pieddepage"/>
       <w:rPr>
         <w:rFonts w:ascii="Times New Roman" w:hAnsi="Times New Roman"/>
@@ -878,6 +839,84 @@
         <w:lang w:bidi="ar-MA"/>
       </w:rPr>
     </w:pPr>
+    <w:r>
+      <w:rPr>
+        <w:rFonts w:asciiTheme="majorHAnsi" w:hAnsiTheme="majorHAnsi"/>
+        <w:noProof/>
+        <w:rtl/>
+        <w:lang w:eastAsia="fr-FR"/>
+      </w:rPr>
+      <w:drawing>
+        <wp:anchor distT="0" distB="0" distL="114300" distR="114300" simplePos="0" relativeHeight="251659264" behindDoc="1" locked="0" layoutInCell="1" allowOverlap="1" wp14:anchorId="63707110" wp14:editId="6BAE4DFF">
+          <wp:simplePos x="0" y="0"/>
+          <wp:positionH relativeFrom="column">
+            <wp:posOffset>-866775</wp:posOffset>
+          </wp:positionH>
+          <wp:positionV relativeFrom="paragraph">
+            <wp:posOffset>-457091</wp:posOffset>
+          </wp:positionV>
+          <wp:extent cx="7520940" cy="1496695"/>
+          <wp:effectExtent l="0" t="0" r="3810" b="8255"/>
+          <wp:wrapThrough wrapText="bothSides">
+            <wp:wrapPolygon edited="0">
+              <wp:start x="0" y="0"/>
+              <wp:lineTo x="0" y="21444"/>
+              <wp:lineTo x="21556" y="21444"/>
+              <wp:lineTo x="21556" y="0"/>
+              <wp:lineTo x="0" y="0"/>
+            </wp:wrapPolygon>
+          </wp:wrapThrough>
+          <wp:docPr id="16" name="Image 1" descr="C:\Users\master\Downloads\MEE-Papier-entête_Plan de travail 1.jpg"/>
+          <wp:cNvGraphicFramePr>
+            <a:graphicFrameLocks xmlns:a="http://schemas.openxmlformats.org/drawingml/2006/main" noChangeAspect="1"/>
+          </wp:cNvGraphicFramePr>
+          <a:graphic xmlns:a="http://schemas.openxmlformats.org/drawingml/2006/main">
+            <a:graphicData uri="http://schemas.openxmlformats.org/drawingml/2006/picture">
+              <pic:pic xmlns:pic="http://schemas.openxmlformats.org/drawingml/2006/picture">
+                <pic:nvPicPr>
+                  <pic:cNvPr id="0" name="Picture 1" descr="C:\Users\master\Downloads\MEE-Papier-entête_Plan de travail 1.jpg"/>
+                  <pic:cNvPicPr>
+                    <a:picLocks noChangeAspect="1" noChangeArrowheads="1"/>
+                  </pic:cNvPicPr>
+                </pic:nvPicPr>
+                <pic:blipFill>
+                  <a:blip r:embed="rId1" cstate="print">
+                    <a:extLst>
+                      <a:ext uri="{28A0092B-C50C-407E-A947-70E740481C1C}">
+                        <a14:useLocalDpi xmlns:a14="http://schemas.microsoft.com/office/drawing/2010/main" val="0"/>
+                      </a:ext>
+                    </a:extLst>
+                  </a:blip>
+                  <a:srcRect/>
+                  <a:stretch>
+                    <a:fillRect/>
+                  </a:stretch>
+                </pic:blipFill>
+                <pic:spPr bwMode="auto">
+                  <a:xfrm>
+                    <a:off x="0" y="0"/>
+                    <a:ext cx="7520940" cy="1496695"/>
+                  </a:xfrm>
+                  <a:prstGeom prst="rect">
+                    <a:avLst/>
+                  </a:prstGeom>
+                  <a:noFill/>
+                  <a:ln w="9525">
+                    <a:noFill/>
+                    <a:miter lim="800000"/>
+                    <a:headEnd/>
+                    <a:tailEnd/>
+                  </a:ln>
+                </pic:spPr>
+              </pic:pic>
+            </a:graphicData>
+          </a:graphic>
+          <wp14:sizeRelV relativeFrom="margin">
+            <wp14:pctHeight>0</wp14:pctHeight>
+          </wp14:sizeRelV>
+        </wp:anchor>
+      </w:drawing>
+    </w:r>
   </w:p>
   <w:p>
     <w:pPr>

</xml_diff>